<commit_message>
Update published links in 数字识别实验报告.docx
</commit_message>
<xml_diff>
--- a/数字识别实验报告.docx
+++ b/数字识别实验报告.docx
@@ -1978,7 +1978,7 @@
         <w:ind w:firstLine="420"/>
       </w:pPr>
       <w:r>
-        <w:t>当前工程尚未绑定 GitHub 远程仓库，因此以下地址是上传后需要替换的链接。上传源码后，建议将 best_model.pth 放在 GitHub Release 附件中，避免直接提交大文件到普通源码目录。</w:t>
+        <w:t>源码仓库和预训练模型已经发布到 GitHub。best_model.pth 放在 GitHub Release v1.0 附件中，便于下载和复现实验。</w:t>
       </w:r>
     </w:p>
     <w:tbl>
@@ -2083,7 +2083,7 @@
                 <w:color w:val="000000"/>
                 <w:sz w:val="18"/>
               </w:rPr>
-              <w:t>https://github.com/&lt;用户名&gt;/CDUTexperiment-1</w:t>
+              <w:t>https://github.com/xiaofeiyang666/CDUTexperiment-1</w:t>
             </w:r>
           </w:p>
         </w:tc>
@@ -2127,7 +2127,7 @@
                 <w:color w:val="000000"/>
                 <w:sz w:val="18"/>
               </w:rPr>
-              <w:t>https://github.com/&lt;用户名&gt;/CDUTexperiment-1/releases/download/v1.0/best_model.pth</w:t>
+              <w:t>https://github.com/xiaofeiyang666/CDUTexperiment-1/releases/download/v1.0/best_model.pth</w:t>
             </w:r>
           </w:p>
         </w:tc>
@@ -2184,7 +2184,7 @@
         <w:ind w:firstLine="420"/>
       </w:pPr>
       <w:r>
-        <w:t>上传建议：创建 GitHub 仓库后上传 model.py、model_train.py、model_test.py、generate_report_evidence.py、README.md 以及报告所需的结果文件；创建 Release v1.0 并将 best_model.pth 作为附件上传，然后把上表的两个占位 URL 替换为实际地址。</w:t>
+        <w:t>仓库中包含 model.py、model_train.py、model_test.py、generate_report_evidence.py、README.md 以及报告所需的结果文件；Release v1.0 中提供 best_model.pth 预训练模型下载。</w:t>
       </w:r>
     </w:p>
     <w:p>

</xml_diff>